<commit_message>
chore: update Turkish resume with corrected translation and English labels
Fix 'Strong' to 'Güçlü' in Turkish text and localize section headers and contact info to English in PDF and Markdown files.
</commit_message>
<xml_diff>
--- a/public/data/Resume-TR.docx
+++ b/public/data/Resume-TR.docx
@@ -19,9 +19,9 @@
           <w:b/>
           <w:bCs/>
         </w:rPr>
-        <w:t xml:space="preserve">E-posta: </w:t>
-      </w:r>
-      <w:hyperlink w:history="1" r:id="rIdtt1plqgllhyz6-hsr5kw_">
+        <w:t xml:space="preserve">E-mail: </w:t>
+      </w:r>
+      <w:hyperlink w:history="1" r:id="rIdc8qg_wdmlvw7ls7zznczq">
         <w:r>
           <w:rPr>
             <w:rStyle w:val="Hyperlink"/>
@@ -39,9 +39,9 @@
           <w:b/>
           <w:bCs/>
         </w:rPr>
-        <w:t xml:space="preserve">Telefon: </w:t>
-      </w:r>
-      <w:hyperlink w:history="1" r:id="rIdjpzgj7uwhzlkxn47gfrmd">
+        <w:t xml:space="preserve">Phone: </w:t>
+      </w:r>
+      <w:hyperlink w:history="1" r:id="rIdxv52lfjbwdnzlgeyhgw57">
         <w:r>
           <w:rPr>
             <w:rStyle w:val="Hyperlink"/>
@@ -59,7 +59,7 @@
           <w:b/>
           <w:bCs/>
         </w:rPr>
-        <w:t xml:space="preserve">Adres: </w:t>
+        <w:t xml:space="preserve">Address: </w:t>
       </w:r>
       <w:r>
         <w:t xml:space="preserve">ÇEKMEKÖY, İSTANBUL, TÜRKİYE</w:t>
@@ -74,9 +74,9 @@
           <w:b/>
           <w:bCs/>
         </w:rPr>
-        <w:t xml:space="preserve">Web Sitesi: </w:t>
-      </w:r>
-      <w:hyperlink w:history="1" r:id="rIdtwetky3qx8_nzcqpzusni">
+        <w:t xml:space="preserve">Website: </w:t>
+      </w:r>
+      <w:hyperlink w:history="1" r:id="rIdi_tnbd6bjcwxjpbhv6zrs">
         <w:r>
           <w:rPr>
             <w:rStyle w:val="Hyperlink"/>
@@ -90,7 +90,7 @@
         <w:pStyle w:val="Heading2"/>
       </w:pPr>
       <w:r>
-        <w:t xml:space="preserve">PROFESYONEL ÖZET</w:t>
+        <w:t xml:space="preserve">PROFESSIONAL SUMMARY</w:t>
       </w:r>
     </w:p>
     <w:p>
@@ -98,17 +98,7 @@
         <w:spacing w:after="120"/>
       </w:pPr>
       <w:r>
-        <w:t xml:space="preserve">Kurumsal yazılımlar, ERP sistemleri, dağıtık sistemler, mikroservisler, web, masaüstü ve mobil uygulamaların tasarımı, geliştirilmesi ve yayına alınmasında 10 yılı aşkın deneyime sahip </w:t>
-      </w:r>
-      <w:r>
-        <w:rPr>
-          <w:b/>
-          <w:bCs/>
-        </w:rPr>
-        <w:t xml:space="preserve">Kıdemli Yazılım Geliştirici ve Yazılım Mimarı</w:t>
-      </w:r>
-      <w:r>
-        <w:t xml:space="preserve">.</w:t>
+        <w:t xml:space="preserve">Kurumsal yazılımlar, ERP sistemleri, dağıtık sistemler, mikroservisler, web, masaüstü ve mobil uygulamaların tasarımı, geliştirilmesi ve yayına alınmasında 10 yılı aşkın deneyime sahip Kıdemli Yazılım Geliştirici ve Yazılım Mimarı.</w:t>
       </w:r>
     </w:p>
     <w:p>
@@ -116,7 +106,7 @@
         <w:spacing w:after="120"/>
       </w:pPr>
       <w:r>
-        <w:t xml:space="preserve">Strong C# ve .NET geçmişi; .NET Core, ASP.NET Core, ASP.NET MVC, Web API, Entity Framework Core, WCF, WPF ve WinForms teknolojilerini içerir. SOLID prensipleri (Single Responsibility, Open/Closed, Liskov Substitution, Interface Segregation, ve Dependency Inversion), Clean Architecture, Domain-Driven Design (DDD), Command Query Responsibility Segregation (CQRS), N-Tier mimarisi, API Gateway ve RESTful API desenlerini kullanarak çözüm mimarisi ve sistem tasarımı konularında deneyimlidir.</w:t>
+        <w:t xml:space="preserve">Güçlü C# ve .NET geçmişi; .NET Core, ASP.NET Core, ASP.NET MVC, Web API, Entity Framework Core, WCF, WPF ve WinForms teknolojilerini içerir. SOLID prensipleri (Single Responsibility, Open/Closed, Liskov Substitution, Interface Segregation, ve Dependency Inversion), Clean Architecture, Domain-Driven Design (DDD), Command Query Responsibility Segregation (CQRS), N-Tier mimarisi, API Gateway ve RESTful API desenlerini kullanarak çözüm mimarisi ve sistem tasarımı konularında deneyimlidir.</w:t>
       </w:r>
     </w:p>
     <w:p>
@@ -148,17 +138,7 @@
         <w:spacing w:after="120"/>
       </w:pPr>
       <w:r>
-        <w:t xml:space="preserve"/>
-      </w:r>
-      <w:r>
-        <w:rPr>
-          <w:b/>
-          <w:bCs/>
-        </w:rPr>
-        <w:t xml:space="preserve">Microsoft Sertifikalı,</w:t>
-      </w:r>
-      <w:r>
-        <w:t xml:space="preserve"> Azure Data Engineer Associate - 2025.</w:t>
+        <w:t xml:space="preserve">Microsoft Sertifikalı, Azure Data Engineer Associate - 2025.</w:t>
       </w:r>
     </w:p>
     <w:p>
@@ -166,7 +146,7 @@
         <w:pStyle w:val="Heading2"/>
       </w:pPr>
       <w:r>
-        <w:t xml:space="preserve">TEKNİK BECERİLER</w:t>
+        <w:t xml:space="preserve">TECHNICAL SKILLS</w:t>
       </w:r>
     </w:p>
     <w:p>
@@ -402,7 +382,7 @@
         <w:pStyle w:val="Heading2"/>
       </w:pPr>
       <w:r>
-        <w:t xml:space="preserve">İŞ DENEYİMİ</w:t>
+        <w:t xml:space="preserve">PROFESSIONAL EXPERIENCE</w:t>
       </w:r>
     </w:p>
     <w:p>
@@ -946,14 +926,14 @@
         <w:pStyle w:val="Heading2"/>
       </w:pPr>
       <w:r>
-        <w:t xml:space="preserve">PROJELER</w:t>
+        <w:t xml:space="preserve">PROJECTS</w:t>
       </w:r>
     </w:p>
     <w:p>
       <w:r>
         <w:t xml:space="preserve">Ek kişisel projelerimi de içeren çalışmalarımın tamamı </w:t>
       </w:r>
-      <w:hyperlink w:history="1" r:id="rIdmw2pia5xps_-dxji3i5uk">
+      <w:hyperlink w:history="1" r:id="rIdhmoxxyapbwfoni0rdkpog">
         <w:r>
           <w:rPr>
             <w:rStyle w:val="Hyperlink"/>
@@ -972,7 +952,7 @@
       <w:r>
         <w:t xml:space="preserve">Distributed File Fragmentor - </w:t>
       </w:r>
-      <w:hyperlink w:history="1" r:id="rIdcvqhccpnm6kpf25ep1msv">
+      <w:hyperlink w:history="1" r:id="rId5hakxvvvltfcmj3gkwbze">
         <w:r>
           <w:rPr>
             <w:rStyle w:val="Hyperlink"/>
@@ -993,7 +973,7 @@
           <w:b/>
           <w:bCs/>
         </w:rPr>
-        <w:t xml:space="preserve">Teknolojiler: </w:t>
+        <w:t xml:space="preserve">Technologies: </w:t>
       </w:r>
       <w:r>
         <w:t xml:space="preserve"> .NET 9, Clean Architecture, SOLID Principles, CQRS, EF Core 9, System.CommandLine, Resilience Patterns</w:t>
@@ -1030,7 +1010,7 @@
       <w:r>
         <w:t xml:space="preserve">Meeting System - </w:t>
       </w:r>
-      <w:hyperlink w:history="1" r:id="rIdtn_8cypav4n0vpg04azih">
+      <w:hyperlink w:history="1" r:id="rIdliewoctgnojv9uynfx-lf">
         <w:r>
           <w:rPr>
             <w:rStyle w:val="Hyperlink"/>
@@ -1051,7 +1031,7 @@
           <w:b/>
           <w:bCs/>
         </w:rPr>
-        <w:t xml:space="preserve">Teknolojiler: </w:t>
+        <w:t xml:space="preserve">Technologies: </w:t>
       </w:r>
       <w:r>
         <w:t xml:space="preserve"> .NET 9, Angular 20+, Clean Architecture, SOLID Principles, Docker, MinIO, Hangfire, Testcontainers, RxJS</w:t>
@@ -1096,7 +1076,7 @@
       <w:r>
         <w:t xml:space="preserve">Architectly - </w:t>
       </w:r>
-      <w:hyperlink w:history="1" r:id="rId048xm2ynsfzd0n5it4nnh">
+      <w:hyperlink w:history="1" r:id="rIdf3qwsku-nftddg-t4sigi">
         <w:r>
           <w:rPr>
             <w:rStyle w:val="Hyperlink"/>
@@ -1126,7 +1106,7 @@
           <w:b/>
           <w:bCs/>
         </w:rPr>
-        <w:t xml:space="preserve">Teknolojiler: </w:t>
+        <w:t xml:space="preserve">Technologies: </w:t>
       </w:r>
       <w:r>
         <w:t xml:space="preserve"> SOLID Principles, TypeScript, Vite, Puter.js, i18next, IndexedDB, Signal-Based Reactivity, SCSS, WCAG 2.1 AA</w:t>
@@ -1171,7 +1151,7 @@
       <w:r>
         <w:t xml:space="preserve">Kişisel Web Sitem - </w:t>
       </w:r>
-      <w:hyperlink w:history="1" r:id="rIdv73nnxxhmpp5rrrscgysd">
+      <w:hyperlink w:history="1" r:id="rIdofbwpiucapgluxguwcyyb">
         <w:r>
           <w:rPr>
             <w:rStyle w:val="Hyperlink"/>
@@ -1201,7 +1181,7 @@
           <w:b/>
           <w:bCs/>
         </w:rPr>
-        <w:t xml:space="preserve">Teknolojiler: </w:t>
+        <w:t xml:space="preserve">Technologies: </w:t>
       </w:r>
       <w:r>
         <w:t xml:space="preserve"> SOLID Principles, Atomic Design, React 19, TypeScript, Material-UI (MUI) v7, React Router v7, puter.js, MiniSearch, CSP, GitHub Pages</w:t>
@@ -1254,7 +1234,7 @@
       <w:r>
         <w:t xml:space="preserve">Notification System - </w:t>
       </w:r>
-      <w:hyperlink w:history="1" r:id="rIdrwop81xaljznufqs5kat_">
+      <w:hyperlink w:history="1" r:id="rIdszgojiu4fziv2dhq49jlr">
         <w:r>
           <w:rPr>
             <w:rStyle w:val="Hyperlink"/>
@@ -1275,7 +1255,7 @@
           <w:b/>
           <w:bCs/>
         </w:rPr>
-        <w:t xml:space="preserve">Teknolojiler: </w:t>
+        <w:t xml:space="preserve">Technologies: </w:t>
       </w:r>
       <w:r>
         <w:t xml:space="preserve"> .NET Core, Microservices Architecture, Ocelot API Gateway, Dapper, SQL Server, RESTful API</w:t>
@@ -1311,7 +1291,7 @@
         <w:spacing w:after="0"/>
       </w:pPr>
       <w:r>
-        <w:t xml:space="preserve">EĞİTİM</w:t>
+        <w:t xml:space="preserve">EDUCATION</w:t>
       </w:r>
     </w:p>
     <w:p>
@@ -1353,7 +1333,7 @@
         <w:pStyle w:val="Heading2"/>
       </w:pPr>
       <w:r>
-        <w:t xml:space="preserve">SERTİFİKALAR</w:t>
+        <w:t xml:space="preserve">CERTIFICATIONS</w:t>
       </w:r>
     </w:p>
     <w:p>
@@ -1393,12 +1373,12 @@
       <w:r>
         <w:t xml:space="preserve"> - </w:t>
       </w:r>
-      <w:hyperlink w:history="1" r:id="rIdenshw47mqneplcw0a8x_b">
+      <w:hyperlink w:history="1" r:id="rIdgc9belpldqfkv4f-unuil">
         <w:r>
           <w:rPr>
             <w:rStyle w:val="Hyperlink"/>
           </w:rPr>
-          <w:t xml:space="preserve">Referans</w:t>
+          <w:t xml:space="preserve">Reference</w:t>
         </w:r>
       </w:hyperlink>
     </w:p>
@@ -1442,7 +1422,7 @@
         <w:pStyle w:val="Heading2"/>
       </w:pPr>
       <w:r>
-        <w:t xml:space="preserve">DİLLER</w:t>
+        <w:t xml:space="preserve">LANGUAGES</w:t>
       </w:r>
     </w:p>
     <w:p>

</xml_diff>

<commit_message>
docs: update TR resume with full Turkish translation
- Translate all section headers, contact info, technical skills, experience, and project descriptions from English to Turkish in Resume-TR.pdf
- Update corresponding Resume-TR.docx binary file
</commit_message>
<xml_diff>
--- a/public/data/Resume-TR.docx
+++ b/public/data/Resume-TR.docx
@@ -19,9 +19,9 @@
           <w:b/>
           <w:bCs/>
         </w:rPr>
-        <w:t xml:space="preserve">E-mail: </w:t>
-      </w:r>
-      <w:hyperlink w:history="1" r:id="rIdc8qg_wdmlvw7ls7zznczq">
+        <w:t xml:space="preserve">E-posta: </w:t>
+      </w:r>
+      <w:hyperlink w:history="1" r:id="rIdt_lemkbcmcpm8gehb6hpx">
         <w:r>
           <w:rPr>
             <w:rStyle w:val="Hyperlink"/>
@@ -39,9 +39,9 @@
           <w:b/>
           <w:bCs/>
         </w:rPr>
-        <w:t xml:space="preserve">Phone: </w:t>
-      </w:r>
-      <w:hyperlink w:history="1" r:id="rIdxv52lfjbwdnzlgeyhgw57">
+        <w:t xml:space="preserve">Telefon: </w:t>
+      </w:r>
+      <w:hyperlink w:history="1" r:id="rIdixvf-b_dgiiixvydzlveq">
         <w:r>
           <w:rPr>
             <w:rStyle w:val="Hyperlink"/>
@@ -59,7 +59,7 @@
           <w:b/>
           <w:bCs/>
         </w:rPr>
-        <w:t xml:space="preserve">Address: </w:t>
+        <w:t xml:space="preserve">Adres: </w:t>
       </w:r>
       <w:r>
         <w:t xml:space="preserve">ÇEKMEKÖY, İSTANBUL, TÜRKİYE</w:t>
@@ -74,9 +74,9 @@
           <w:b/>
           <w:bCs/>
         </w:rPr>
-        <w:t xml:space="preserve">Website: </w:t>
-      </w:r>
-      <w:hyperlink w:history="1" r:id="rIdi_tnbd6bjcwxjpbhv6zrs">
+        <w:t xml:space="preserve">Web Sitesi: </w:t>
+      </w:r>
+      <w:hyperlink w:history="1" r:id="rIdb2oewsgv3mzw0-rwqaaf3">
         <w:r>
           <w:rPr>
             <w:rStyle w:val="Hyperlink"/>
@@ -90,7 +90,7 @@
         <w:pStyle w:val="Heading2"/>
       </w:pPr>
       <w:r>
-        <w:t xml:space="preserve">PROFESSIONAL SUMMARY</w:t>
+        <w:t xml:space="preserve">PROFESYONEL ÖZET</w:t>
       </w:r>
     </w:p>
     <w:p>
@@ -98,7 +98,17 @@
         <w:spacing w:after="120"/>
       </w:pPr>
       <w:r>
-        <w:t xml:space="preserve">Kurumsal yazılımlar, ERP sistemleri, dağıtık sistemler, mikroservisler, web, masaüstü ve mobil uygulamaların tasarımı, geliştirilmesi ve yayına alınmasında 10 yılı aşkın deneyime sahip Kıdemli Yazılım Geliştirici ve Yazılım Mimarı.</w:t>
+        <w:t xml:space="preserve">Kurumsal yazılımlar, ERP sistemleri, dağıtık sistemler, mikroservisler, web, masaüstü ve mobil uygulamaların tasarımı, geliştirilmesi ve yayına alınmasında 10 yılı aşkın deneyime sahip </w:t>
+      </w:r>
+      <w:r>
+        <w:rPr>
+          <w:b/>
+          <w:bCs/>
+        </w:rPr>
+        <w:t xml:space="preserve">Kıdemli Yazılım Geliştirici ve Yazılım Mimarı</w:t>
+      </w:r>
+      <w:r>
+        <w:t xml:space="preserve">.</w:t>
       </w:r>
     </w:p>
     <w:p>
@@ -138,7 +148,17 @@
         <w:spacing w:after="120"/>
       </w:pPr>
       <w:r>
-        <w:t xml:space="preserve">Microsoft Sertifikalı, Azure Data Engineer Associate - 2025.</w:t>
+        <w:t xml:space="preserve"/>
+      </w:r>
+      <w:r>
+        <w:rPr>
+          <w:b/>
+          <w:bCs/>
+        </w:rPr>
+        <w:t xml:space="preserve">Microsoft Sertifikalı,</w:t>
+      </w:r>
+      <w:r>
+        <w:t xml:space="preserve"> Azure Data Engineer Associate - 2025.</w:t>
       </w:r>
     </w:p>
     <w:p>
@@ -146,7 +166,7 @@
         <w:pStyle w:val="Heading2"/>
       </w:pPr>
       <w:r>
-        <w:t xml:space="preserve">TECHNICAL SKILLS</w:t>
+        <w:t xml:space="preserve">TEKNİK BECERİLER</w:t>
       </w:r>
     </w:p>
     <w:p>
@@ -382,7 +402,7 @@
         <w:pStyle w:val="Heading2"/>
       </w:pPr>
       <w:r>
-        <w:t xml:space="preserve">PROFESSIONAL EXPERIENCE</w:t>
+        <w:t xml:space="preserve">İŞ DENEYİMİ</w:t>
       </w:r>
     </w:p>
     <w:p>
@@ -926,14 +946,14 @@
         <w:pStyle w:val="Heading2"/>
       </w:pPr>
       <w:r>
-        <w:t xml:space="preserve">PROJECTS</w:t>
+        <w:t xml:space="preserve">PROJELER</w:t>
       </w:r>
     </w:p>
     <w:p>
       <w:r>
         <w:t xml:space="preserve">Ek kişisel projelerimi de içeren çalışmalarımın tamamı </w:t>
       </w:r>
-      <w:hyperlink w:history="1" r:id="rIdhmoxxyapbwfoni0rdkpog">
+      <w:hyperlink w:history="1" r:id="rIdtbehjreobeikhr5p33a6w">
         <w:r>
           <w:rPr>
             <w:rStyle w:val="Hyperlink"/>
@@ -952,7 +972,7 @@
       <w:r>
         <w:t xml:space="preserve">Distributed File Fragmentor - </w:t>
       </w:r>
-      <w:hyperlink w:history="1" r:id="rId5hakxvvvltfcmj3gkwbze">
+      <w:hyperlink w:history="1" r:id="rIdoqtekaj2epwzxug079rq9">
         <w:r>
           <w:rPr>
             <w:rStyle w:val="Hyperlink"/>
@@ -973,7 +993,7 @@
           <w:b/>
           <w:bCs/>
         </w:rPr>
-        <w:t xml:space="preserve">Technologies: </w:t>
+        <w:t xml:space="preserve">Teknolojiler: </w:t>
       </w:r>
       <w:r>
         <w:t xml:space="preserve"> .NET 9, Clean Architecture, SOLID Principles, CQRS, EF Core 9, System.CommandLine, Resilience Patterns</w:t>
@@ -1010,7 +1030,7 @@
       <w:r>
         <w:t xml:space="preserve">Meeting System - </w:t>
       </w:r>
-      <w:hyperlink w:history="1" r:id="rIdliewoctgnojv9uynfx-lf">
+      <w:hyperlink w:history="1" r:id="rIdatfnoh-8ouoec30radrlr">
         <w:r>
           <w:rPr>
             <w:rStyle w:val="Hyperlink"/>
@@ -1031,7 +1051,7 @@
           <w:b/>
           <w:bCs/>
         </w:rPr>
-        <w:t xml:space="preserve">Technologies: </w:t>
+        <w:t xml:space="preserve">Teknolojiler: </w:t>
       </w:r>
       <w:r>
         <w:t xml:space="preserve"> .NET 9, Angular 20+, Clean Architecture, SOLID Principles, Docker, MinIO, Hangfire, Testcontainers, RxJS</w:t>
@@ -1076,7 +1096,7 @@
       <w:r>
         <w:t xml:space="preserve">Architectly - </w:t>
       </w:r>
-      <w:hyperlink w:history="1" r:id="rIdf3qwsku-nftddg-t4sigi">
+      <w:hyperlink w:history="1" r:id="rIdxpdbxkif_an0imaxs9hcx">
         <w:r>
           <w:rPr>
             <w:rStyle w:val="Hyperlink"/>
@@ -1106,7 +1126,7 @@
           <w:b/>
           <w:bCs/>
         </w:rPr>
-        <w:t xml:space="preserve">Technologies: </w:t>
+        <w:t xml:space="preserve">Teknolojiler: </w:t>
       </w:r>
       <w:r>
         <w:t xml:space="preserve"> SOLID Principles, TypeScript, Vite, Puter.js, i18next, IndexedDB, Signal-Based Reactivity, SCSS, WCAG 2.1 AA</w:t>
@@ -1151,7 +1171,7 @@
       <w:r>
         <w:t xml:space="preserve">Kişisel Web Sitem - </w:t>
       </w:r>
-      <w:hyperlink w:history="1" r:id="rIdofbwpiucapgluxguwcyyb">
+      <w:hyperlink w:history="1" r:id="rIdoyl6tna1cpr5luqetux-m">
         <w:r>
           <w:rPr>
             <w:rStyle w:val="Hyperlink"/>
@@ -1181,7 +1201,7 @@
           <w:b/>
           <w:bCs/>
         </w:rPr>
-        <w:t xml:space="preserve">Technologies: </w:t>
+        <w:t xml:space="preserve">Teknolojiler: </w:t>
       </w:r>
       <w:r>
         <w:t xml:space="preserve"> SOLID Principles, Atomic Design, React 19, TypeScript, Material-UI (MUI) v7, React Router v7, puter.js, MiniSearch, CSP, GitHub Pages</w:t>
@@ -1234,7 +1254,7 @@
       <w:r>
         <w:t xml:space="preserve">Notification System - </w:t>
       </w:r>
-      <w:hyperlink w:history="1" r:id="rIdszgojiu4fziv2dhq49jlr">
+      <w:hyperlink w:history="1" r:id="rId7ahmg9iw4rat45gtw-0yw">
         <w:r>
           <w:rPr>
             <w:rStyle w:val="Hyperlink"/>
@@ -1255,7 +1275,7 @@
           <w:b/>
           <w:bCs/>
         </w:rPr>
-        <w:t xml:space="preserve">Technologies: </w:t>
+        <w:t xml:space="preserve">Teknolojiler: </w:t>
       </w:r>
       <w:r>
         <w:t xml:space="preserve"> .NET Core, Microservices Architecture, Ocelot API Gateway, Dapper, SQL Server, RESTful API</w:t>
@@ -1291,7 +1311,7 @@
         <w:spacing w:after="0"/>
       </w:pPr>
       <w:r>
-        <w:t xml:space="preserve">EDUCATION</w:t>
+        <w:t xml:space="preserve">EĞİTİM</w:t>
       </w:r>
     </w:p>
     <w:p>
@@ -1333,7 +1353,7 @@
         <w:pStyle w:val="Heading2"/>
       </w:pPr>
       <w:r>
-        <w:t xml:space="preserve">CERTIFICATIONS</w:t>
+        <w:t xml:space="preserve">SERTİFİKALAR</w:t>
       </w:r>
     </w:p>
     <w:p>
@@ -1373,12 +1393,12 @@
       <w:r>
         <w:t xml:space="preserve"> - </w:t>
       </w:r>
-      <w:hyperlink w:history="1" r:id="rIdgc9belpldqfkv4f-unuil">
+      <w:hyperlink w:history="1" r:id="rIdw0fafpb4ibvesn5odgjpa">
         <w:r>
           <w:rPr>
             <w:rStyle w:val="Hyperlink"/>
           </w:rPr>
-          <w:t xml:space="preserve">Reference</w:t>
+          <w:t xml:space="preserve">Referans</w:t>
         </w:r>
       </w:hyperlink>
     </w:p>
@@ -1422,7 +1442,7 @@
         <w:pStyle w:val="Heading2"/>
       </w:pPr>
       <w:r>
-        <w:t xml:space="preserve">LANGUAGES</w:t>
+        <w:t xml:space="preserve">DİLLER</w:t>
       </w:r>
     </w:p>
     <w:p>

</xml_diff>